<commit_message>
Actualizacion pipeline en aws y detección de anomalías
</commit_message>
<xml_diff>
--- a/TFM_MarioSoto/src/codigo/procesamiento_datos/docs/aws_pipeline.docx
+++ b/TFM_MarioSoto/src/codigo/procesamiento_datos/docs/aws_pipeline.docx
@@ -15,10 +15,10 @@
         <w:tblLook w:val="04A0" w:firstRow="1" w:lastRow="0" w:firstColumn="1" w:lastColumn="0" w:noHBand="0" w:noVBand="1"/>
       </w:tblPr>
       <w:tblGrid>
-        <w:gridCol w:w="1930"/>
-        <w:gridCol w:w="1801"/>
-        <w:gridCol w:w="1647"/>
-        <w:gridCol w:w="3126"/>
+        <w:gridCol w:w="2702"/>
+        <w:gridCol w:w="1334"/>
+        <w:gridCol w:w="1304"/>
+        <w:gridCol w:w="3164"/>
       </w:tblGrid>
       <w:tr>
         <w:trPr>
@@ -130,20 +130,47 @@
                 <w:b/>
                 <w:bCs/>
               </w:rPr>
-              <w:t>Step Functions</w:t>
-            </w:r>
-          </w:p>
-        </w:tc>
-        <w:tc>
-          <w:tcPr>
-            <w:tcW w:w="0" w:type="auto"/>
-            <w:vAlign w:val="center"/>
-            <w:hideMark/>
-          </w:tcPr>
-          <w:p>
-            <w:r>
-              <w:t>Application Integration → Step Functions</w:t>
-            </w:r>
+              <w:t xml:space="preserve">Step </w:t>
+            </w:r>
+            <w:proofErr w:type="spellStart"/>
+            <w:r>
+              <w:rPr>
+                <w:b/>
+                <w:bCs/>
+              </w:rPr>
+              <w:t>Functions</w:t>
+            </w:r>
+            <w:proofErr w:type="spellEnd"/>
+          </w:p>
+        </w:tc>
+        <w:tc>
+          <w:tcPr>
+            <w:tcW w:w="0" w:type="auto"/>
+            <w:vAlign w:val="center"/>
+            <w:hideMark/>
+          </w:tcPr>
+          <w:p>
+            <w:proofErr w:type="spellStart"/>
+            <w:r>
+              <w:t>Application</w:t>
+            </w:r>
+            <w:proofErr w:type="spellEnd"/>
+            <w:r>
+              <w:t xml:space="preserve"> </w:t>
+            </w:r>
+            <w:proofErr w:type="spellStart"/>
+            <w:r>
+              <w:t>Integration</w:t>
+            </w:r>
+            <w:proofErr w:type="spellEnd"/>
+            <w:r>
+              <w:t xml:space="preserve"> → Step </w:t>
+            </w:r>
+            <w:proofErr w:type="spellStart"/>
+            <w:r>
+              <w:t>Functions</w:t>
+            </w:r>
+            <w:proofErr w:type="spellEnd"/>
           </w:p>
         </w:tc>
         <w:tc>
@@ -174,7 +201,23 @@
               <w:rPr>
                 <w:lang w:val="en-GB"/>
               </w:rPr>
-              <w:t>Flechas punteadas → Glue Crawler, Glue ETL, Glue Feature Eng, SageMaker Training</w:t>
+              <w:t xml:space="preserve">Flechas </w:t>
+            </w:r>
+            <w:proofErr w:type="spellStart"/>
+            <w:r>
+              <w:rPr>
+                <w:b/>
+                <w:bCs/>
+                <w:lang w:val="en-GB"/>
+              </w:rPr>
+              <w:t>punteadas</w:t>
+            </w:r>
+            <w:proofErr w:type="spellEnd"/>
+            <w:r>
+              <w:rPr>
+                <w:lang w:val="en-GB"/>
+              </w:rPr>
+              <w:t xml:space="preserve"> → S3 RAW, Glue Crawler, Glue ETL, Glue Feature Engineering, SageMaker Training, Offline Models Runner</w:t>
             </w:r>
           </w:p>
         </w:tc>
@@ -219,20 +262,43 @@
           </w:tcPr>
           <w:p>
             <w:r>
-              <w:t>Primera fila</w:t>
-            </w:r>
-          </w:p>
-        </w:tc>
-        <w:tc>
-          <w:tcPr>
-            <w:tcW w:w="0" w:type="auto"/>
-            <w:vAlign w:val="center"/>
-            <w:hideMark/>
-          </w:tcPr>
-          <w:p>
-            <w:r>
-              <w:t>Flecha sólida → Glue Crawler</w:t>
-            </w:r>
+              <w:t>Primera fila izquierda</w:t>
+            </w:r>
+          </w:p>
+        </w:tc>
+        <w:tc>
+          <w:tcPr>
+            <w:tcW w:w="0" w:type="auto"/>
+            <w:vAlign w:val="center"/>
+            <w:hideMark/>
+          </w:tcPr>
+          <w:p>
+            <w:r>
+              <w:t xml:space="preserve">Flecha </w:t>
+            </w:r>
+            <w:r>
+              <w:rPr>
+                <w:b/>
+                <w:bCs/>
+              </w:rPr>
+              <w:t>sólida</w:t>
+            </w:r>
+            <w:r>
+              <w:t xml:space="preserve"> → </w:t>
+            </w:r>
+            <w:proofErr w:type="spellStart"/>
+            <w:r>
+              <w:t>Glue</w:t>
+            </w:r>
+            <w:proofErr w:type="spellEnd"/>
+            <w:r>
+              <w:t xml:space="preserve"> </w:t>
+            </w:r>
+            <w:proofErr w:type="spellStart"/>
+            <w:r>
+              <w:t>Crawler</w:t>
+            </w:r>
+            <w:proofErr w:type="spellEnd"/>
           </w:p>
         </w:tc>
       </w:tr>
@@ -247,49 +313,108 @@
             <w:hideMark/>
           </w:tcPr>
           <w:p>
-            <w:r>
-              <w:rPr>
-                <w:b/>
-                <w:bCs/>
-              </w:rPr>
-              <w:t>Glue Crawler</w:t>
-            </w:r>
-          </w:p>
-        </w:tc>
-        <w:tc>
-          <w:tcPr>
-            <w:tcW w:w="0" w:type="auto"/>
-            <w:vAlign w:val="center"/>
-            <w:hideMark/>
-          </w:tcPr>
-          <w:p>
-            <w:r>
-              <w:t>Analytics → Glue Crawler</w:t>
-            </w:r>
-          </w:p>
-        </w:tc>
-        <w:tc>
-          <w:tcPr>
-            <w:tcW w:w="0" w:type="auto"/>
-            <w:vAlign w:val="center"/>
-            <w:hideMark/>
-          </w:tcPr>
-          <w:p>
-            <w:r>
-              <w:t>Segunda fila</w:t>
-            </w:r>
-          </w:p>
-        </w:tc>
-        <w:tc>
-          <w:tcPr>
-            <w:tcW w:w="0" w:type="auto"/>
-            <w:vAlign w:val="center"/>
-            <w:hideMark/>
-          </w:tcPr>
-          <w:p>
-            <w:r>
-              <w:t>Flecha sólida → Glue Data Catalog</w:t>
-            </w:r>
+            <w:proofErr w:type="spellStart"/>
+            <w:r>
+              <w:rPr>
+                <w:b/>
+                <w:bCs/>
+              </w:rPr>
+              <w:t>Glue</w:t>
+            </w:r>
+            <w:proofErr w:type="spellEnd"/>
+            <w:r>
+              <w:rPr>
+                <w:b/>
+                <w:bCs/>
+              </w:rPr>
+              <w:t xml:space="preserve"> </w:t>
+            </w:r>
+            <w:proofErr w:type="spellStart"/>
+            <w:r>
+              <w:rPr>
+                <w:b/>
+                <w:bCs/>
+              </w:rPr>
+              <w:t>Crawler</w:t>
+            </w:r>
+            <w:proofErr w:type="spellEnd"/>
+          </w:p>
+        </w:tc>
+        <w:tc>
+          <w:tcPr>
+            <w:tcW w:w="0" w:type="auto"/>
+            <w:vAlign w:val="center"/>
+            <w:hideMark/>
+          </w:tcPr>
+          <w:p>
+            <w:proofErr w:type="spellStart"/>
+            <w:r>
+              <w:t>Analytics</w:t>
+            </w:r>
+            <w:proofErr w:type="spellEnd"/>
+            <w:r>
+              <w:t xml:space="preserve"> → </w:t>
+            </w:r>
+            <w:proofErr w:type="spellStart"/>
+            <w:r>
+              <w:t>Glue</w:t>
+            </w:r>
+            <w:proofErr w:type="spellEnd"/>
+            <w:r>
+              <w:t xml:space="preserve"> </w:t>
+            </w:r>
+            <w:proofErr w:type="spellStart"/>
+            <w:r>
+              <w:t>Crawler</w:t>
+            </w:r>
+            <w:proofErr w:type="spellEnd"/>
+          </w:p>
+        </w:tc>
+        <w:tc>
+          <w:tcPr>
+            <w:tcW w:w="0" w:type="auto"/>
+            <w:vAlign w:val="center"/>
+            <w:hideMark/>
+          </w:tcPr>
+          <w:p>
+            <w:r>
+              <w:t>Segunda fila izquierda</w:t>
+            </w:r>
+          </w:p>
+        </w:tc>
+        <w:tc>
+          <w:tcPr>
+            <w:tcW w:w="0" w:type="auto"/>
+            <w:vAlign w:val="center"/>
+            <w:hideMark/>
+          </w:tcPr>
+          <w:p>
+            <w:r>
+              <w:t xml:space="preserve">Flecha </w:t>
+            </w:r>
+            <w:r>
+              <w:rPr>
+                <w:b/>
+                <w:bCs/>
+              </w:rPr>
+              <w:t>sólida</w:t>
+            </w:r>
+            <w:r>
+              <w:t xml:space="preserve"> → </w:t>
+            </w:r>
+            <w:proofErr w:type="spellStart"/>
+            <w:r>
+              <w:t>Glue</w:t>
+            </w:r>
+            <w:proofErr w:type="spellEnd"/>
+            <w:r>
+              <w:t xml:space="preserve"> Data </w:t>
+            </w:r>
+            <w:proofErr w:type="spellStart"/>
+            <w:r>
+              <w:t>Catalog</w:t>
+            </w:r>
+            <w:proofErr w:type="spellEnd"/>
           </w:p>
         </w:tc>
       </w:tr>
@@ -304,48 +429,107 @@
             <w:hideMark/>
           </w:tcPr>
           <w:p>
-            <w:r>
-              <w:rPr>
-                <w:b/>
-                <w:bCs/>
-              </w:rPr>
-              <w:t>Glue Data Catalog</w:t>
-            </w:r>
-          </w:p>
-        </w:tc>
-        <w:tc>
-          <w:tcPr>
-            <w:tcW w:w="0" w:type="auto"/>
-            <w:vAlign w:val="center"/>
-            <w:hideMark/>
-          </w:tcPr>
-          <w:p>
-            <w:r>
-              <w:t>Analytics → Glue Data Catalog</w:t>
-            </w:r>
-          </w:p>
-        </w:tc>
-        <w:tc>
-          <w:tcPr>
-            <w:tcW w:w="0" w:type="auto"/>
-            <w:vAlign w:val="center"/>
-            <w:hideMark/>
-          </w:tcPr>
-          <w:p>
-            <w:r>
-              <w:t>Segunda fila, encima Glue Crawler</w:t>
-            </w:r>
-          </w:p>
-        </w:tc>
-        <w:tc>
-          <w:tcPr>
-            <w:tcW w:w="0" w:type="auto"/>
-            <w:vAlign w:val="center"/>
-            <w:hideMark/>
-          </w:tcPr>
-          <w:p>
-            <w:r>
-              <w:t>Flecha sólida → Glue ETL</w:t>
+            <w:proofErr w:type="spellStart"/>
+            <w:r>
+              <w:rPr>
+                <w:b/>
+                <w:bCs/>
+              </w:rPr>
+              <w:t>Glue</w:t>
+            </w:r>
+            <w:proofErr w:type="spellEnd"/>
+            <w:r>
+              <w:rPr>
+                <w:b/>
+                <w:bCs/>
+              </w:rPr>
+              <w:t xml:space="preserve"> Data </w:t>
+            </w:r>
+            <w:proofErr w:type="spellStart"/>
+            <w:r>
+              <w:rPr>
+                <w:b/>
+                <w:bCs/>
+              </w:rPr>
+              <w:t>Catalog</w:t>
+            </w:r>
+            <w:proofErr w:type="spellEnd"/>
+          </w:p>
+        </w:tc>
+        <w:tc>
+          <w:tcPr>
+            <w:tcW w:w="0" w:type="auto"/>
+            <w:vAlign w:val="center"/>
+            <w:hideMark/>
+          </w:tcPr>
+          <w:p>
+            <w:proofErr w:type="spellStart"/>
+            <w:r>
+              <w:t>Analytics</w:t>
+            </w:r>
+            <w:proofErr w:type="spellEnd"/>
+            <w:r>
+              <w:t xml:space="preserve"> → </w:t>
+            </w:r>
+            <w:proofErr w:type="spellStart"/>
+            <w:r>
+              <w:t>Glue</w:t>
+            </w:r>
+            <w:proofErr w:type="spellEnd"/>
+            <w:r>
+              <w:t xml:space="preserve"> Data </w:t>
+            </w:r>
+            <w:proofErr w:type="spellStart"/>
+            <w:r>
+              <w:t>Catalog</w:t>
+            </w:r>
+            <w:proofErr w:type="spellEnd"/>
+          </w:p>
+        </w:tc>
+        <w:tc>
+          <w:tcPr>
+            <w:tcW w:w="0" w:type="auto"/>
+            <w:vAlign w:val="center"/>
+            <w:hideMark/>
+          </w:tcPr>
+          <w:p>
+            <w:r>
+              <w:t xml:space="preserve">Segunda fila, encima del </w:t>
+            </w:r>
+            <w:proofErr w:type="spellStart"/>
+            <w:r>
+              <w:t>Crawler</w:t>
+            </w:r>
+            <w:proofErr w:type="spellEnd"/>
+          </w:p>
+        </w:tc>
+        <w:tc>
+          <w:tcPr>
+            <w:tcW w:w="0" w:type="auto"/>
+            <w:vAlign w:val="center"/>
+            <w:hideMark/>
+          </w:tcPr>
+          <w:p>
+            <w:r>
+              <w:t xml:space="preserve">Flecha </w:t>
+            </w:r>
+            <w:r>
+              <w:rPr>
+                <w:b/>
+                <w:bCs/>
+              </w:rPr>
+              <w:t>sólida</w:t>
+            </w:r>
+            <w:r>
+              <w:t xml:space="preserve"> → </w:t>
+            </w:r>
+            <w:proofErr w:type="spellStart"/>
+            <w:r>
+              <w:t>Glue</w:t>
+            </w:r>
+            <w:proofErr w:type="spellEnd"/>
+            <w:r>
+              <w:t xml:space="preserve"> ETL</w:t>
             </w:r>
           </w:p>
         </w:tc>
@@ -361,48 +545,124 @@
             <w:hideMark/>
           </w:tcPr>
           <w:p>
-            <w:r>
-              <w:rPr>
-                <w:b/>
-                <w:bCs/>
-              </w:rPr>
-              <w:t>Glue ETL Job</w:t>
-            </w:r>
-          </w:p>
-        </w:tc>
-        <w:tc>
-          <w:tcPr>
-            <w:tcW w:w="0" w:type="auto"/>
-            <w:vAlign w:val="center"/>
-            <w:hideMark/>
-          </w:tcPr>
-          <w:p>
-            <w:r>
-              <w:t>Analytics → Glue Job</w:t>
-            </w:r>
-          </w:p>
-        </w:tc>
-        <w:tc>
-          <w:tcPr>
-            <w:tcW w:w="0" w:type="auto"/>
-            <w:vAlign w:val="center"/>
-            <w:hideMark/>
-          </w:tcPr>
-          <w:p>
-            <w:r>
-              <w:t>Tercera fila</w:t>
-            </w:r>
-          </w:p>
-        </w:tc>
-        <w:tc>
-          <w:tcPr>
-            <w:tcW w:w="0" w:type="auto"/>
-            <w:vAlign w:val="center"/>
-            <w:hideMark/>
-          </w:tcPr>
-          <w:p>
-            <w:r>
-              <w:t>Flecha sólida → S3 PROCESSED; flecha punteada → Alerta / SNS</w:t>
+            <w:proofErr w:type="spellStart"/>
+            <w:r>
+              <w:rPr>
+                <w:b/>
+                <w:bCs/>
+              </w:rPr>
+              <w:t>Glue</w:t>
+            </w:r>
+            <w:proofErr w:type="spellEnd"/>
+            <w:r>
+              <w:rPr>
+                <w:b/>
+                <w:bCs/>
+              </w:rPr>
+              <w:t xml:space="preserve"> ETL Job (</w:t>
+            </w:r>
+            <w:proofErr w:type="spellStart"/>
+            <w:r>
+              <w:rPr>
+                <w:b/>
+                <w:bCs/>
+              </w:rPr>
+              <w:t>Cleaning</w:t>
+            </w:r>
+            <w:proofErr w:type="spellEnd"/>
+            <w:r>
+              <w:rPr>
+                <w:b/>
+                <w:bCs/>
+              </w:rPr>
+              <w:t>)</w:t>
+            </w:r>
+          </w:p>
+        </w:tc>
+        <w:tc>
+          <w:tcPr>
+            <w:tcW w:w="0" w:type="auto"/>
+            <w:vAlign w:val="center"/>
+            <w:hideMark/>
+          </w:tcPr>
+          <w:p>
+            <w:proofErr w:type="spellStart"/>
+            <w:r>
+              <w:t>Analytics</w:t>
+            </w:r>
+            <w:proofErr w:type="spellEnd"/>
+            <w:r>
+              <w:t xml:space="preserve"> → </w:t>
+            </w:r>
+            <w:proofErr w:type="spellStart"/>
+            <w:r>
+              <w:t>Glue</w:t>
+            </w:r>
+            <w:proofErr w:type="spellEnd"/>
+            <w:r>
+              <w:t xml:space="preserve"> Job</w:t>
+            </w:r>
+          </w:p>
+        </w:tc>
+        <w:tc>
+          <w:tcPr>
+            <w:tcW w:w="0" w:type="auto"/>
+            <w:vAlign w:val="center"/>
+            <w:hideMark/>
+          </w:tcPr>
+          <w:p>
+            <w:r>
+              <w:t>Tercera fila izquierda</w:t>
+            </w:r>
+          </w:p>
+        </w:tc>
+        <w:tc>
+          <w:tcPr>
+            <w:tcW w:w="0" w:type="auto"/>
+            <w:vAlign w:val="center"/>
+            <w:hideMark/>
+          </w:tcPr>
+          <w:p>
+            <w:r>
+              <w:t xml:space="preserve">Flecha </w:t>
+            </w:r>
+            <w:r>
+              <w:rPr>
+                <w:b/>
+                <w:bCs/>
+              </w:rPr>
+              <w:t>sólida</w:t>
+            </w:r>
+            <w:r>
+              <w:t xml:space="preserve"> → S3 PROCESSED; flecha </w:t>
+            </w:r>
+            <w:r>
+              <w:rPr>
+                <w:b/>
+                <w:bCs/>
+              </w:rPr>
+              <w:t>punteada</w:t>
+            </w:r>
+            <w:r>
+              <w:t xml:space="preserve"> → SNS Alerta; flecha </w:t>
+            </w:r>
+            <w:r>
+              <w:rPr>
+                <w:b/>
+                <w:bCs/>
+              </w:rPr>
+              <w:t>punteada</w:t>
+            </w:r>
+            <w:r>
+              <w:t xml:space="preserve"> → </w:t>
+            </w:r>
+            <w:proofErr w:type="spellStart"/>
+            <w:r>
+              <w:t>Metadata</w:t>
+            </w:r>
+            <w:proofErr w:type="spellEnd"/>
+            <w:r>
+              <w:t xml:space="preserve"> Store</w:t>
             </w:r>
           </w:p>
         </w:tc>
@@ -447,19 +707,67 @@
           </w:tcPr>
           <w:p>
             <w:r>
-              <w:t>Debajo Glue ETL</w:t>
-            </w:r>
-          </w:p>
-        </w:tc>
-        <w:tc>
-          <w:tcPr>
-            <w:tcW w:w="0" w:type="auto"/>
-            <w:vAlign w:val="center"/>
-            <w:hideMark/>
-          </w:tcPr>
-          <w:p>
-            <w:r>
-              <w:t>Flecha sólida → Glue Feature Engineering</w:t>
+              <w:t xml:space="preserve">Debajo de </w:t>
+            </w:r>
+            <w:proofErr w:type="spellStart"/>
+            <w:r>
+              <w:t>Glue</w:t>
+            </w:r>
+            <w:proofErr w:type="spellEnd"/>
+            <w:r>
+              <w:t xml:space="preserve"> ETL</w:t>
+            </w:r>
+          </w:p>
+        </w:tc>
+        <w:tc>
+          <w:tcPr>
+            <w:tcW w:w="0" w:type="auto"/>
+            <w:vAlign w:val="center"/>
+            <w:hideMark/>
+          </w:tcPr>
+          <w:p>
+            <w:pPr>
+              <w:rPr>
+                <w:lang w:val="en-GB"/>
+              </w:rPr>
+            </w:pPr>
+            <w:r>
+              <w:rPr>
+                <w:lang w:val="en-GB"/>
+              </w:rPr>
+              <w:t xml:space="preserve">Flecha </w:t>
+            </w:r>
+            <w:proofErr w:type="spellStart"/>
+            <w:r>
+              <w:rPr>
+                <w:b/>
+                <w:bCs/>
+                <w:lang w:val="en-GB"/>
+              </w:rPr>
+              <w:t>sólida</w:t>
+            </w:r>
+            <w:proofErr w:type="spellEnd"/>
+            <w:r>
+              <w:rPr>
+                <w:lang w:val="en-GB"/>
+              </w:rPr>
+              <w:t xml:space="preserve"> → Glue Feature Engineering; Flecha </w:t>
+            </w:r>
+            <w:proofErr w:type="spellStart"/>
+            <w:r>
+              <w:rPr>
+                <w:b/>
+                <w:bCs/>
+                <w:lang w:val="en-GB"/>
+              </w:rPr>
+              <w:t>sólida</w:t>
+            </w:r>
+            <w:proofErr w:type="spellEnd"/>
+            <w:r>
+              <w:rPr>
+                <w:lang w:val="en-GB"/>
+              </w:rPr>
+              <w:t xml:space="preserve"> → Offline Models Runner</w:t>
             </w:r>
           </w:p>
         </w:tc>
@@ -475,48 +783,133 @@
             <w:hideMark/>
           </w:tcPr>
           <w:p>
-            <w:r>
-              <w:rPr>
-                <w:b/>
-                <w:bCs/>
-              </w:rPr>
-              <w:t>Glue Feature Engineering</w:t>
-            </w:r>
-          </w:p>
-        </w:tc>
-        <w:tc>
-          <w:tcPr>
-            <w:tcW w:w="0" w:type="auto"/>
-            <w:vAlign w:val="center"/>
-            <w:hideMark/>
-          </w:tcPr>
-          <w:p>
-            <w:r>
-              <w:t>Analytics → Glue Job</w:t>
-            </w:r>
-          </w:p>
-        </w:tc>
-        <w:tc>
-          <w:tcPr>
-            <w:tcW w:w="0" w:type="auto"/>
-            <w:vAlign w:val="center"/>
-            <w:hideMark/>
-          </w:tcPr>
-          <w:p>
-            <w:r>
-              <w:t>Cuarta fila</w:t>
-            </w:r>
-          </w:p>
-        </w:tc>
-        <w:tc>
-          <w:tcPr>
-            <w:tcW w:w="0" w:type="auto"/>
-            <w:vAlign w:val="center"/>
-            <w:hideMark/>
-          </w:tcPr>
-          <w:p>
-            <w:r>
-              <w:t>Flecha sólida → S3 FEATURES; flecha punteada → Alerta / SNS</w:t>
+            <w:proofErr w:type="spellStart"/>
+            <w:r>
+              <w:rPr>
+                <w:b/>
+                <w:bCs/>
+              </w:rPr>
+              <w:t>Glue</w:t>
+            </w:r>
+            <w:proofErr w:type="spellEnd"/>
+            <w:r>
+              <w:rPr>
+                <w:b/>
+                <w:bCs/>
+              </w:rPr>
+              <w:t xml:space="preserve"> </w:t>
+            </w:r>
+            <w:proofErr w:type="spellStart"/>
+            <w:r>
+              <w:rPr>
+                <w:b/>
+                <w:bCs/>
+              </w:rPr>
+              <w:t>Feature</w:t>
+            </w:r>
+            <w:proofErr w:type="spellEnd"/>
+            <w:r>
+              <w:rPr>
+                <w:b/>
+                <w:bCs/>
+              </w:rPr>
+              <w:t xml:space="preserve"> </w:t>
+            </w:r>
+            <w:proofErr w:type="spellStart"/>
+            <w:r>
+              <w:rPr>
+                <w:b/>
+                <w:bCs/>
+              </w:rPr>
+              <w:t>Engineering</w:t>
+            </w:r>
+            <w:proofErr w:type="spellEnd"/>
+          </w:p>
+        </w:tc>
+        <w:tc>
+          <w:tcPr>
+            <w:tcW w:w="0" w:type="auto"/>
+            <w:vAlign w:val="center"/>
+            <w:hideMark/>
+          </w:tcPr>
+          <w:p>
+            <w:proofErr w:type="spellStart"/>
+            <w:r>
+              <w:t>Analytics</w:t>
+            </w:r>
+            <w:proofErr w:type="spellEnd"/>
+            <w:r>
+              <w:t xml:space="preserve"> → </w:t>
+            </w:r>
+            <w:proofErr w:type="spellStart"/>
+            <w:r>
+              <w:t>Glue</w:t>
+            </w:r>
+            <w:proofErr w:type="spellEnd"/>
+            <w:r>
+              <w:t xml:space="preserve"> Job</w:t>
+            </w:r>
+          </w:p>
+        </w:tc>
+        <w:tc>
+          <w:tcPr>
+            <w:tcW w:w="0" w:type="auto"/>
+            <w:vAlign w:val="center"/>
+            <w:hideMark/>
+          </w:tcPr>
+          <w:p>
+            <w:r>
+              <w:t>Cuarta fila izquierda</w:t>
+            </w:r>
+          </w:p>
+        </w:tc>
+        <w:tc>
+          <w:tcPr>
+            <w:tcW w:w="0" w:type="auto"/>
+            <w:vAlign w:val="center"/>
+            <w:hideMark/>
+          </w:tcPr>
+          <w:p>
+            <w:r>
+              <w:t xml:space="preserve">Flecha </w:t>
+            </w:r>
+            <w:r>
+              <w:rPr>
+                <w:b/>
+                <w:bCs/>
+              </w:rPr>
+              <w:t>sólida</w:t>
+            </w:r>
+            <w:r>
+              <w:t xml:space="preserve"> → S3 FEATURES; flecha </w:t>
+            </w:r>
+            <w:r>
+              <w:rPr>
+                <w:b/>
+                <w:bCs/>
+              </w:rPr>
+              <w:t>punteada</w:t>
+            </w:r>
+            <w:r>
+              <w:t xml:space="preserve"> → SNS Alerta; flecha </w:t>
+            </w:r>
+            <w:r>
+              <w:rPr>
+                <w:b/>
+                <w:bCs/>
+              </w:rPr>
+              <w:t>punteada</w:t>
+            </w:r>
+            <w:r>
+              <w:t xml:space="preserve"> → </w:t>
+            </w:r>
+            <w:proofErr w:type="spellStart"/>
+            <w:r>
+              <w:t>Metadata</w:t>
+            </w:r>
+            <w:proofErr w:type="spellEnd"/>
+            <w:r>
+              <w:t xml:space="preserve"> Store</w:t>
             </w:r>
           </w:p>
         </w:tc>
@@ -561,19 +954,68 @@
           </w:tcPr>
           <w:p>
             <w:r>
-              <w:t>Debajo Glue Feature Engineering</w:t>
-            </w:r>
-          </w:p>
-        </w:tc>
-        <w:tc>
-          <w:tcPr>
-            <w:tcW w:w="0" w:type="auto"/>
-            <w:vAlign w:val="center"/>
-            <w:hideMark/>
-          </w:tcPr>
-          <w:p>
-            <w:r>
-              <w:t>Flechas sólidas → SageMaker Training para modelos</w:t>
+              <w:t xml:space="preserve">Debajo de </w:t>
+            </w:r>
+            <w:proofErr w:type="spellStart"/>
+            <w:r>
+              <w:t>Feature</w:t>
+            </w:r>
+            <w:proofErr w:type="spellEnd"/>
+            <w:r>
+              <w:t xml:space="preserve"> </w:t>
+            </w:r>
+            <w:proofErr w:type="spellStart"/>
+            <w:r>
+              <w:t>Engineering</w:t>
+            </w:r>
+            <w:proofErr w:type="spellEnd"/>
+          </w:p>
+        </w:tc>
+        <w:tc>
+          <w:tcPr>
+            <w:tcW w:w="0" w:type="auto"/>
+            <w:vAlign w:val="center"/>
+            <w:hideMark/>
+          </w:tcPr>
+          <w:p>
+            <w:r>
+              <w:t xml:space="preserve">Flecha </w:t>
+            </w:r>
+            <w:r>
+              <w:rPr>
+                <w:b/>
+                <w:bCs/>
+              </w:rPr>
+              <w:t>sólida</w:t>
+            </w:r>
+            <w:r>
+              <w:t xml:space="preserve"> → </w:t>
+            </w:r>
+            <w:proofErr w:type="spellStart"/>
+            <w:r>
+              <w:t>SageMaker</w:t>
+            </w:r>
+            <w:proofErr w:type="spellEnd"/>
+            <w:r>
+              <w:t xml:space="preserve"> Training; flecha </w:t>
+            </w:r>
+            <w:r>
+              <w:rPr>
+                <w:b/>
+                <w:bCs/>
+              </w:rPr>
+              <w:t>punteada</w:t>
+            </w:r>
+            <w:r>
+              <w:t xml:space="preserve"> → Lambda (uso online de </w:t>
+            </w:r>
+            <w:proofErr w:type="spellStart"/>
+            <w:r>
+              <w:t>features</w:t>
+            </w:r>
+            <w:proofErr w:type="spellEnd"/>
+            <w:r>
+              <w:t>)</w:t>
             </w:r>
           </w:p>
         </w:tc>
@@ -589,48 +1031,114 @@
             <w:hideMark/>
           </w:tcPr>
           <w:p>
-            <w:r>
-              <w:rPr>
-                <w:b/>
-                <w:bCs/>
-              </w:rPr>
-              <w:t>SageMaker Training</w:t>
-            </w:r>
-          </w:p>
-        </w:tc>
-        <w:tc>
-          <w:tcPr>
-            <w:tcW w:w="0" w:type="auto"/>
-            <w:vAlign w:val="center"/>
-            <w:hideMark/>
-          </w:tcPr>
-          <w:p>
-            <w:r>
-              <w:t>Machine Learning → SageMaker</w:t>
-            </w:r>
-          </w:p>
-        </w:tc>
-        <w:tc>
-          <w:tcPr>
-            <w:tcW w:w="0" w:type="auto"/>
-            <w:vAlign w:val="center"/>
-            <w:hideMark/>
-          </w:tcPr>
-          <w:p>
-            <w:r>
-              <w:t>Quinta fila</w:t>
-            </w:r>
-          </w:p>
-        </w:tc>
-        <w:tc>
-          <w:tcPr>
-            <w:tcW w:w="0" w:type="auto"/>
-            <w:vAlign w:val="center"/>
-            <w:hideMark/>
-          </w:tcPr>
-          <w:p>
-            <w:r>
-              <w:t>Flechas sólidas → S3 MODELS / RESULTS y MLflow / Model Registry</w:t>
+            <w:proofErr w:type="spellStart"/>
+            <w:r>
+              <w:rPr>
+                <w:b/>
+                <w:bCs/>
+              </w:rPr>
+              <w:t>SageMaker</w:t>
+            </w:r>
+            <w:proofErr w:type="spellEnd"/>
+            <w:r>
+              <w:rPr>
+                <w:b/>
+                <w:bCs/>
+              </w:rPr>
+              <w:t xml:space="preserve"> Training</w:t>
+            </w:r>
+          </w:p>
+        </w:tc>
+        <w:tc>
+          <w:tcPr>
+            <w:tcW w:w="0" w:type="auto"/>
+            <w:vAlign w:val="center"/>
+            <w:hideMark/>
+          </w:tcPr>
+          <w:p>
+            <w:r>
+              <w:t xml:space="preserve">Machine </w:t>
+            </w:r>
+            <w:proofErr w:type="spellStart"/>
+            <w:r>
+              <w:t>Learning</w:t>
+            </w:r>
+            <w:proofErr w:type="spellEnd"/>
+            <w:r>
+              <w:t xml:space="preserve"> → </w:t>
+            </w:r>
+            <w:proofErr w:type="spellStart"/>
+            <w:r>
+              <w:t>SageMaker</w:t>
+            </w:r>
+            <w:proofErr w:type="spellEnd"/>
+          </w:p>
+        </w:tc>
+        <w:tc>
+          <w:tcPr>
+            <w:tcW w:w="0" w:type="auto"/>
+            <w:vAlign w:val="center"/>
+            <w:hideMark/>
+          </w:tcPr>
+          <w:p>
+            <w:r>
+              <w:t>Quinta fila izquierda</w:t>
+            </w:r>
+          </w:p>
+        </w:tc>
+        <w:tc>
+          <w:tcPr>
+            <w:tcW w:w="0" w:type="auto"/>
+            <w:vAlign w:val="center"/>
+            <w:hideMark/>
+          </w:tcPr>
+          <w:p>
+            <w:r>
+              <w:t xml:space="preserve">Flechas </w:t>
+            </w:r>
+            <w:r>
+              <w:rPr>
+                <w:b/>
+                <w:bCs/>
+              </w:rPr>
+              <w:t>sólidas</w:t>
+            </w:r>
+            <w:r>
+              <w:t xml:space="preserve"> → S3 MODELS / RESULTS, </w:t>
+            </w:r>
+            <w:proofErr w:type="spellStart"/>
+            <w:r>
+              <w:t>Model</w:t>
+            </w:r>
+            <w:proofErr w:type="spellEnd"/>
+            <w:r>
+              <w:t xml:space="preserve"> </w:t>
+            </w:r>
+            <w:proofErr w:type="spellStart"/>
+            <w:r>
+              <w:t>Registry</w:t>
+            </w:r>
+            <w:proofErr w:type="spellEnd"/>
+            <w:r>
+              <w:t xml:space="preserve">; flecha </w:t>
+            </w:r>
+            <w:r>
+              <w:rPr>
+                <w:b/>
+                <w:bCs/>
+              </w:rPr>
+              <w:t>punteada</w:t>
+            </w:r>
+            <w:r>
+              <w:t xml:space="preserve"> → </w:t>
+            </w:r>
+            <w:proofErr w:type="spellStart"/>
+            <w:r>
+              <w:t>Metadata</w:t>
+            </w:r>
+            <w:proofErr w:type="spellEnd"/>
+            <w:r>
+              <w:t xml:space="preserve"> Store</w:t>
             </w:r>
           </w:p>
         </w:tc>
@@ -675,19 +1183,45 @@
           </w:tcPr>
           <w:p>
             <w:r>
-              <w:t>Debajo SageMaker Training</w:t>
-            </w:r>
-          </w:p>
-        </w:tc>
-        <w:tc>
-          <w:tcPr>
-            <w:tcW w:w="0" w:type="auto"/>
-            <w:vAlign w:val="center"/>
-            <w:hideMark/>
-          </w:tcPr>
-          <w:p>
-            <w:r>
-              <w:t>Flecha punteada → Online (Lambda / Endpoint)</w:t>
+              <w:t xml:space="preserve">Debajo </w:t>
+            </w:r>
+            <w:proofErr w:type="spellStart"/>
+            <w:r>
+              <w:t>SageMaker</w:t>
+            </w:r>
+            <w:proofErr w:type="spellEnd"/>
+            <w:r>
+              <w:t xml:space="preserve"> Training</w:t>
+            </w:r>
+          </w:p>
+        </w:tc>
+        <w:tc>
+          <w:tcPr>
+            <w:tcW w:w="0" w:type="auto"/>
+            <w:vAlign w:val="center"/>
+            <w:hideMark/>
+          </w:tcPr>
+          <w:p>
+            <w:r>
+              <w:t xml:space="preserve">Flecha </w:t>
+            </w:r>
+            <w:r>
+              <w:rPr>
+                <w:b/>
+                <w:bCs/>
+              </w:rPr>
+              <w:t>punteada</w:t>
+            </w:r>
+            <w:r>
+              <w:t xml:space="preserve"> → Lambda / </w:t>
+            </w:r>
+            <w:proofErr w:type="spellStart"/>
+            <w:r>
+              <w:t>Endpoint</w:t>
+            </w:r>
+            <w:proofErr w:type="spellEnd"/>
+            <w:r>
+              <w:t xml:space="preserve"> (carga de modelo)</w:t>
             </w:r>
           </w:p>
         </w:tc>
@@ -703,48 +1237,113 @@
             <w:hideMark/>
           </w:tcPr>
           <w:p>
-            <w:r>
-              <w:rPr>
-                <w:b/>
-                <w:bCs/>
-              </w:rPr>
-              <w:t>MLflow / Model Registry</w:t>
-            </w:r>
-          </w:p>
-        </w:tc>
-        <w:tc>
-          <w:tcPr>
-            <w:tcW w:w="0" w:type="auto"/>
-            <w:vAlign w:val="center"/>
-            <w:hideMark/>
-          </w:tcPr>
-          <w:p>
-            <w:r>
-              <w:t>Rectángulo genérico o ML icon</w:t>
-            </w:r>
-          </w:p>
-        </w:tc>
-        <w:tc>
-          <w:tcPr>
-            <w:tcW w:w="0" w:type="auto"/>
-            <w:vAlign w:val="center"/>
-            <w:hideMark/>
-          </w:tcPr>
-          <w:p>
-            <w:r>
-              <w:t>Al lado S3 MODELS</w:t>
-            </w:r>
-          </w:p>
-        </w:tc>
-        <w:tc>
-          <w:tcPr>
-            <w:tcW w:w="0" w:type="auto"/>
-            <w:vAlign w:val="center"/>
-            <w:hideMark/>
-          </w:tcPr>
-          <w:p>
-            <w:r>
-              <w:t>Flecha punteada → Online (control y versionamiento)</w:t>
+            <w:proofErr w:type="spellStart"/>
+            <w:r>
+              <w:rPr>
+                <w:b/>
+                <w:bCs/>
+              </w:rPr>
+              <w:t>MLflow</w:t>
+            </w:r>
+            <w:proofErr w:type="spellEnd"/>
+            <w:r>
+              <w:rPr>
+                <w:b/>
+                <w:bCs/>
+              </w:rPr>
+              <w:t xml:space="preserve"> / </w:t>
+            </w:r>
+            <w:proofErr w:type="spellStart"/>
+            <w:r>
+              <w:rPr>
+                <w:b/>
+                <w:bCs/>
+              </w:rPr>
+              <w:t>Model</w:t>
+            </w:r>
+            <w:proofErr w:type="spellEnd"/>
+            <w:r>
+              <w:rPr>
+                <w:b/>
+                <w:bCs/>
+              </w:rPr>
+              <w:t xml:space="preserve"> </w:t>
+            </w:r>
+            <w:proofErr w:type="spellStart"/>
+            <w:r>
+              <w:rPr>
+                <w:b/>
+                <w:bCs/>
+              </w:rPr>
+              <w:t>Registry</w:t>
+            </w:r>
+            <w:proofErr w:type="spellEnd"/>
+          </w:p>
+        </w:tc>
+        <w:tc>
+          <w:tcPr>
+            <w:tcW w:w="0" w:type="auto"/>
+            <w:vAlign w:val="center"/>
+            <w:hideMark/>
+          </w:tcPr>
+          <w:p>
+            <w:r>
+              <w:t xml:space="preserve">Rectángulo genérico o ML </w:t>
+            </w:r>
+            <w:proofErr w:type="spellStart"/>
+            <w:r>
+              <w:t>icon</w:t>
+            </w:r>
+            <w:proofErr w:type="spellEnd"/>
+          </w:p>
+        </w:tc>
+        <w:tc>
+          <w:tcPr>
+            <w:tcW w:w="0" w:type="auto"/>
+            <w:vAlign w:val="center"/>
+            <w:hideMark/>
+          </w:tcPr>
+          <w:p>
+            <w:r>
+              <w:t>A la derecha de S3 MODELS</w:t>
+            </w:r>
+          </w:p>
+        </w:tc>
+        <w:tc>
+          <w:tcPr>
+            <w:tcW w:w="0" w:type="auto"/>
+            <w:vAlign w:val="center"/>
+            <w:hideMark/>
+          </w:tcPr>
+          <w:p>
+            <w:r>
+              <w:t xml:space="preserve">Flecha </w:t>
+            </w:r>
+            <w:r>
+              <w:rPr>
+                <w:b/>
+                <w:bCs/>
+              </w:rPr>
+              <w:t>punteada</w:t>
+            </w:r>
+            <w:r>
+              <w:t xml:space="preserve"> → Lambda / </w:t>
+            </w:r>
+            <w:proofErr w:type="spellStart"/>
+            <w:r>
+              <w:t>Endpoint</w:t>
+            </w:r>
+            <w:proofErr w:type="spellEnd"/>
+            <w:r>
+              <w:t xml:space="preserve"> (</w:t>
+            </w:r>
+            <w:proofErr w:type="spellStart"/>
+            <w:r>
+              <w:t>versionamiento</w:t>
+            </w:r>
+            <w:proofErr w:type="spellEnd"/>
+            <w:r>
+              <w:t>)</w:t>
             </w:r>
           </w:p>
         </w:tc>
@@ -765,43 +1364,116 @@
                 <w:b/>
                 <w:bCs/>
               </w:rPr>
-              <w:t>Alerta / SNS</w:t>
-            </w:r>
-          </w:p>
-        </w:tc>
-        <w:tc>
-          <w:tcPr>
-            <w:tcW w:w="0" w:type="auto"/>
-            <w:vAlign w:val="center"/>
-            <w:hideMark/>
-          </w:tcPr>
-          <w:p>
-            <w:r>
-              <w:t>Notification → SNS / campana roja</w:t>
-            </w:r>
-          </w:p>
-        </w:tc>
-        <w:tc>
-          <w:tcPr>
-            <w:tcW w:w="0" w:type="auto"/>
-            <w:vAlign w:val="center"/>
-            <w:hideMark/>
-          </w:tcPr>
-          <w:p>
-            <w:r>
-              <w:t>Cerca de Glue ETL y Feature Eng</w:t>
-            </w:r>
-          </w:p>
-        </w:tc>
-        <w:tc>
-          <w:tcPr>
-            <w:tcW w:w="0" w:type="auto"/>
-            <w:vAlign w:val="center"/>
-            <w:hideMark/>
-          </w:tcPr>
-          <w:p>
-            <w:r>
-              <w:t>Flechas punteadas desde Glue Jobs</w:t>
+              <w:t xml:space="preserve">Offline </w:t>
+            </w:r>
+            <w:proofErr w:type="spellStart"/>
+            <w:r>
+              <w:rPr>
+                <w:b/>
+                <w:bCs/>
+              </w:rPr>
+              <w:t>Models</w:t>
+            </w:r>
+            <w:proofErr w:type="spellEnd"/>
+            <w:r>
+              <w:rPr>
+                <w:b/>
+                <w:bCs/>
+              </w:rPr>
+              <w:t xml:space="preserve"> Runner (Interpolación + Anomalías)</w:t>
+            </w:r>
+          </w:p>
+        </w:tc>
+        <w:tc>
+          <w:tcPr>
+            <w:tcW w:w="0" w:type="auto"/>
+            <w:vAlign w:val="center"/>
+            <w:hideMark/>
+          </w:tcPr>
+          <w:p>
+            <w:pPr>
+              <w:rPr>
+                <w:lang w:val="en-GB"/>
+              </w:rPr>
+            </w:pPr>
+            <w:r>
+              <w:rPr>
+                <w:lang w:val="en-GB"/>
+              </w:rPr>
+              <w:t>ML icon / Compute → Batch Job</w:t>
+            </w:r>
+          </w:p>
+        </w:tc>
+        <w:tc>
+          <w:tcPr>
+            <w:tcW w:w="0" w:type="auto"/>
+            <w:vAlign w:val="center"/>
+            <w:hideMark/>
+          </w:tcPr>
+          <w:p>
+            <w:r>
+              <w:t>Debajo de S3 PROCESSED</w:t>
+            </w:r>
+          </w:p>
+        </w:tc>
+        <w:tc>
+          <w:tcPr>
+            <w:tcW w:w="0" w:type="auto"/>
+            <w:vAlign w:val="center"/>
+            <w:hideMark/>
+          </w:tcPr>
+          <w:p>
+            <w:r>
+              <w:t xml:space="preserve">Flecha </w:t>
+            </w:r>
+            <w:r>
+              <w:rPr>
+                <w:b/>
+                <w:bCs/>
+              </w:rPr>
+              <w:t>sólida</w:t>
+            </w:r>
+            <w:r>
+              <w:t xml:space="preserve"> → S3 PROCESSED_RESULTS; flecha </w:t>
+            </w:r>
+            <w:r>
+              <w:rPr>
+                <w:b/>
+                <w:bCs/>
+              </w:rPr>
+              <w:t>sólida</w:t>
+            </w:r>
+            <w:r>
+              <w:t xml:space="preserve"> ← S3 FEATURES; flecha </w:t>
+            </w:r>
+            <w:r>
+              <w:rPr>
+                <w:b/>
+                <w:bCs/>
+              </w:rPr>
+              <w:lastRenderedPageBreak/>
+              <w:t>sólida</w:t>
+            </w:r>
+            <w:r>
+              <w:t xml:space="preserve"> ← S3 PROCESSED; flecha </w:t>
+            </w:r>
+            <w:r>
+              <w:rPr>
+                <w:b/>
+                <w:bCs/>
+              </w:rPr>
+              <w:t>punteada</w:t>
+            </w:r>
+            <w:r>
+              <w:t xml:space="preserve"> ← </w:t>
+            </w:r>
+            <w:proofErr w:type="spellStart"/>
+            <w:r>
+              <w:t>SageMaker</w:t>
+            </w:r>
+            <w:proofErr w:type="spellEnd"/>
+            <w:r>
+              <w:t xml:space="preserve"> Training (modelos entrenados)</w:t>
             </w:r>
           </w:p>
         </w:tc>
@@ -822,49 +1494,1428 @@
                 <w:b/>
                 <w:bCs/>
               </w:rPr>
-              <w:t>SageMaker Experiments / Metadata Store</w:t>
-            </w:r>
-          </w:p>
-        </w:tc>
-        <w:tc>
-          <w:tcPr>
-            <w:tcW w:w="0" w:type="auto"/>
-            <w:vAlign w:val="center"/>
-            <w:hideMark/>
-          </w:tcPr>
-          <w:p>
-            <w:r>
-              <w:t>ML / generic icon</w:t>
-            </w:r>
-          </w:p>
-        </w:tc>
-        <w:tc>
-          <w:tcPr>
-            <w:tcW w:w="0" w:type="auto"/>
-            <w:vAlign w:val="center"/>
-            <w:hideMark/>
-          </w:tcPr>
-          <w:p>
-            <w:r>
-              <w:t>Al lado SageMaker Training</w:t>
-            </w:r>
-          </w:p>
-        </w:tc>
-        <w:tc>
-          <w:tcPr>
-            <w:tcW w:w="0" w:type="auto"/>
-            <w:vAlign w:val="center"/>
-            <w:hideMark/>
-          </w:tcPr>
-          <w:p>
-            <w:r>
-              <w:t>Conecta a Training y Feature Store para trazabilidad</w:t>
+              <w:lastRenderedPageBreak/>
+              <w:t>S3 PROCESSED_RESULTS (JSON final de anomalías/interpolación)</w:t>
+            </w:r>
+          </w:p>
+        </w:tc>
+        <w:tc>
+          <w:tcPr>
+            <w:tcW w:w="0" w:type="auto"/>
+            <w:vAlign w:val="center"/>
+            <w:hideMark/>
+          </w:tcPr>
+          <w:p>
+            <w:r>
+              <w:t>Storage → S3</w:t>
+            </w:r>
+          </w:p>
+        </w:tc>
+        <w:tc>
+          <w:tcPr>
+            <w:tcW w:w="0" w:type="auto"/>
+            <w:vAlign w:val="center"/>
+            <w:hideMark/>
+          </w:tcPr>
+          <w:p>
+            <w:r>
+              <w:t xml:space="preserve">Debajo de Offline </w:t>
+            </w:r>
+            <w:proofErr w:type="spellStart"/>
+            <w:r>
+              <w:t>Models</w:t>
+            </w:r>
+            <w:proofErr w:type="spellEnd"/>
+            <w:r>
+              <w:t xml:space="preserve"> Runner</w:t>
+            </w:r>
+          </w:p>
+        </w:tc>
+        <w:tc>
+          <w:tcPr>
+            <w:tcW w:w="0" w:type="auto"/>
+            <w:vAlign w:val="center"/>
+            <w:hideMark/>
+          </w:tcPr>
+          <w:p>
+            <w:r>
+              <w:t xml:space="preserve">Sin salida obligatoria; puede enviar flecha </w:t>
+            </w:r>
+            <w:r>
+              <w:rPr>
+                <w:b/>
+                <w:bCs/>
+              </w:rPr>
+              <w:t>punteada</w:t>
+            </w:r>
+            <w:r>
+              <w:t xml:space="preserve"> → </w:t>
+            </w:r>
+            <w:proofErr w:type="spellStart"/>
+            <w:r>
+              <w:t>Glue</w:t>
+            </w:r>
+            <w:proofErr w:type="spellEnd"/>
+            <w:r>
+              <w:t xml:space="preserve"> / UI interna</w:t>
+            </w:r>
+          </w:p>
+        </w:tc>
+      </w:tr>
+      <w:tr>
+        <w:trPr>
+          <w:tblCellSpacing w:w="15" w:type="dxa"/>
+        </w:trPr>
+        <w:tc>
+          <w:tcPr>
+            <w:tcW w:w="0" w:type="auto"/>
+            <w:vAlign w:val="center"/>
+            <w:hideMark/>
+          </w:tcPr>
+          <w:p>
+            <w:r>
+              <w:rPr>
+                <w:b/>
+                <w:bCs/>
+              </w:rPr>
+              <w:t>SNS Alerta</w:t>
+            </w:r>
+          </w:p>
+        </w:tc>
+        <w:tc>
+          <w:tcPr>
+            <w:tcW w:w="0" w:type="auto"/>
+            <w:vAlign w:val="center"/>
+            <w:hideMark/>
+          </w:tcPr>
+          <w:p>
+            <w:proofErr w:type="spellStart"/>
+            <w:r>
+              <w:t>Notification</w:t>
+            </w:r>
+            <w:proofErr w:type="spellEnd"/>
+            <w:r>
+              <w:t xml:space="preserve"> → SNS</w:t>
+            </w:r>
+          </w:p>
+        </w:tc>
+        <w:tc>
+          <w:tcPr>
+            <w:tcW w:w="0" w:type="auto"/>
+            <w:vAlign w:val="center"/>
+            <w:hideMark/>
+          </w:tcPr>
+          <w:p>
+            <w:r>
+              <w:t xml:space="preserve">Cerca de ETL y </w:t>
+            </w:r>
+            <w:proofErr w:type="spellStart"/>
+            <w:r>
+              <w:t>Feature</w:t>
+            </w:r>
+            <w:proofErr w:type="spellEnd"/>
+            <w:r>
+              <w:t xml:space="preserve"> Eng</w:t>
+            </w:r>
+          </w:p>
+        </w:tc>
+        <w:tc>
+          <w:tcPr>
+            <w:tcW w:w="0" w:type="auto"/>
+            <w:vAlign w:val="center"/>
+            <w:hideMark/>
+          </w:tcPr>
+          <w:p>
+            <w:r>
+              <w:t xml:space="preserve">Flechas </w:t>
+            </w:r>
+            <w:r>
+              <w:rPr>
+                <w:b/>
+                <w:bCs/>
+              </w:rPr>
+              <w:t>punteadas</w:t>
+            </w:r>
+            <w:r>
+              <w:t xml:space="preserve"> desde </w:t>
+            </w:r>
+            <w:proofErr w:type="spellStart"/>
+            <w:r>
+              <w:t>Glue</w:t>
+            </w:r>
+            <w:proofErr w:type="spellEnd"/>
+            <w:r>
+              <w:t xml:space="preserve"> ETL y </w:t>
+            </w:r>
+            <w:proofErr w:type="spellStart"/>
+            <w:r>
+              <w:t>Feature</w:t>
+            </w:r>
+            <w:proofErr w:type="spellEnd"/>
+            <w:r>
+              <w:t xml:space="preserve"> Eng</w:t>
+            </w:r>
+          </w:p>
+        </w:tc>
+      </w:tr>
+      <w:tr>
+        <w:trPr>
+          <w:tblCellSpacing w:w="15" w:type="dxa"/>
+        </w:trPr>
+        <w:tc>
+          <w:tcPr>
+            <w:tcW w:w="0" w:type="auto"/>
+            <w:vAlign w:val="center"/>
+            <w:hideMark/>
+          </w:tcPr>
+          <w:p>
+            <w:proofErr w:type="spellStart"/>
+            <w:r>
+              <w:rPr>
+                <w:b/>
+                <w:bCs/>
+              </w:rPr>
+              <w:t>SageMaker</w:t>
+            </w:r>
+            <w:proofErr w:type="spellEnd"/>
+            <w:r>
+              <w:rPr>
+                <w:b/>
+                <w:bCs/>
+              </w:rPr>
+              <w:t xml:space="preserve"> </w:t>
+            </w:r>
+            <w:proofErr w:type="spellStart"/>
+            <w:r>
+              <w:rPr>
+                <w:b/>
+                <w:bCs/>
+              </w:rPr>
+              <w:t>Experiments</w:t>
+            </w:r>
+            <w:proofErr w:type="spellEnd"/>
+            <w:r>
+              <w:rPr>
+                <w:b/>
+                <w:bCs/>
+              </w:rPr>
+              <w:t xml:space="preserve"> / </w:t>
+            </w:r>
+            <w:proofErr w:type="spellStart"/>
+            <w:r>
+              <w:rPr>
+                <w:b/>
+                <w:bCs/>
+              </w:rPr>
+              <w:t>Metadata</w:t>
+            </w:r>
+            <w:proofErr w:type="spellEnd"/>
+            <w:r>
+              <w:rPr>
+                <w:b/>
+                <w:bCs/>
+              </w:rPr>
+              <w:t xml:space="preserve"> Store</w:t>
+            </w:r>
+          </w:p>
+        </w:tc>
+        <w:tc>
+          <w:tcPr>
+            <w:tcW w:w="0" w:type="auto"/>
+            <w:vAlign w:val="center"/>
+            <w:hideMark/>
+          </w:tcPr>
+          <w:p>
+            <w:r>
+              <w:t xml:space="preserve">ML → </w:t>
+            </w:r>
+            <w:proofErr w:type="spellStart"/>
+            <w:r>
+              <w:t>Metadata</w:t>
+            </w:r>
+            <w:proofErr w:type="spellEnd"/>
+          </w:p>
+        </w:tc>
+        <w:tc>
+          <w:tcPr>
+            <w:tcW w:w="0" w:type="auto"/>
+            <w:vAlign w:val="center"/>
+            <w:hideMark/>
+          </w:tcPr>
+          <w:p>
+            <w:r>
+              <w:t xml:space="preserve">A la derecha de </w:t>
+            </w:r>
+            <w:proofErr w:type="spellStart"/>
+            <w:r>
+              <w:t>SageMaker</w:t>
+            </w:r>
+            <w:proofErr w:type="spellEnd"/>
+            <w:r>
+              <w:t xml:space="preserve"> Training</w:t>
+            </w:r>
+          </w:p>
+        </w:tc>
+        <w:tc>
+          <w:tcPr>
+            <w:tcW w:w="0" w:type="auto"/>
+            <w:vAlign w:val="center"/>
+            <w:hideMark/>
+          </w:tcPr>
+          <w:p>
+            <w:pPr>
+              <w:rPr>
+                <w:lang w:val="en-GB"/>
+              </w:rPr>
+            </w:pPr>
+            <w:r>
+              <w:rPr>
+                <w:lang w:val="en-GB"/>
+              </w:rPr>
+              <w:t xml:space="preserve">Flechas </w:t>
+            </w:r>
+            <w:proofErr w:type="spellStart"/>
+            <w:r>
+              <w:rPr>
+                <w:b/>
+                <w:bCs/>
+                <w:lang w:val="en-GB"/>
+              </w:rPr>
+              <w:t>punteadas</w:t>
+            </w:r>
+            <w:proofErr w:type="spellEnd"/>
+            <w:r>
+              <w:rPr>
+                <w:lang w:val="en-GB"/>
+              </w:rPr>
+              <w:t xml:space="preserve"> </w:t>
+            </w:r>
+            <w:proofErr w:type="spellStart"/>
+            <w:r>
+              <w:rPr>
+                <w:lang w:val="en-GB"/>
+              </w:rPr>
+              <w:t>desde</w:t>
+            </w:r>
+            <w:proofErr w:type="spellEnd"/>
+            <w:r>
+              <w:rPr>
+                <w:lang w:val="en-GB"/>
+              </w:rPr>
+              <w:t xml:space="preserve"> Glue ETL, Feature Eng, SageMaker Training</w:t>
             </w:r>
           </w:p>
         </w:tc>
       </w:tr>
     </w:tbl>
-    <w:p/>
+    <w:p>
+      <w:pPr>
+        <w:rPr>
+          <w:lang w:val="en-GB"/>
+        </w:rPr>
+      </w:pPr>
+    </w:p>
+    <w:p>
+      <w:pPr>
+        <w:rPr>
+          <w:lang w:val="en-GB"/>
+        </w:rPr>
+      </w:pPr>
+    </w:p>
+    <w:p>
+      <w:pPr>
+        <w:rPr>
+          <w:lang w:val="en-GB"/>
+        </w:rPr>
+      </w:pPr>
+    </w:p>
+    <w:p>
+      <w:pPr>
+        <w:rPr>
+          <w:lang w:val="en-GB"/>
+        </w:rPr>
+      </w:pPr>
+    </w:p>
+    <w:tbl>
+      <w:tblPr>
+        <w:tblW w:w="0" w:type="auto"/>
+        <w:tblCellSpacing w:w="15" w:type="dxa"/>
+        <w:tblCellMar>
+          <w:top w:w="15" w:type="dxa"/>
+          <w:left w:w="15" w:type="dxa"/>
+          <w:bottom w:w="15" w:type="dxa"/>
+          <w:right w:w="15" w:type="dxa"/>
+        </w:tblCellMar>
+        <w:tblLook w:val="04A0" w:firstRow="1" w:lastRow="0" w:firstColumn="1" w:lastColumn="0" w:noHBand="0" w:noVBand="1"/>
+      </w:tblPr>
+      <w:tblGrid>
+        <w:gridCol w:w="1921"/>
+        <w:gridCol w:w="1765"/>
+        <w:gridCol w:w="1309"/>
+        <w:gridCol w:w="3509"/>
+      </w:tblGrid>
+      <w:tr>
+        <w:trPr>
+          <w:tblHeader/>
+          <w:tblCellSpacing w:w="15" w:type="dxa"/>
+        </w:trPr>
+        <w:tc>
+          <w:tcPr>
+            <w:tcW w:w="0" w:type="auto"/>
+            <w:vAlign w:val="center"/>
+            <w:hideMark/>
+          </w:tcPr>
+          <w:p>
+            <w:pPr>
+              <w:rPr>
+                <w:b/>
+                <w:bCs/>
+              </w:rPr>
+            </w:pPr>
+            <w:r>
+              <w:rPr>
+                <w:b/>
+                <w:bCs/>
+              </w:rPr>
+              <w:t>Elemento</w:t>
+            </w:r>
+          </w:p>
+        </w:tc>
+        <w:tc>
+          <w:tcPr>
+            <w:tcW w:w="0" w:type="auto"/>
+            <w:vAlign w:val="center"/>
+            <w:hideMark/>
+          </w:tcPr>
+          <w:p>
+            <w:pPr>
+              <w:rPr>
+                <w:b/>
+                <w:bCs/>
+              </w:rPr>
+            </w:pPr>
+            <w:r>
+              <w:rPr>
+                <w:b/>
+                <w:bCs/>
+              </w:rPr>
+              <w:t>Icono draw.io</w:t>
+            </w:r>
+          </w:p>
+        </w:tc>
+        <w:tc>
+          <w:tcPr>
+            <w:tcW w:w="0" w:type="auto"/>
+            <w:vAlign w:val="center"/>
+            <w:hideMark/>
+          </w:tcPr>
+          <w:p>
+            <w:pPr>
+              <w:rPr>
+                <w:b/>
+                <w:bCs/>
+              </w:rPr>
+            </w:pPr>
+            <w:r>
+              <w:rPr>
+                <w:b/>
+                <w:bCs/>
+              </w:rPr>
+              <w:t>Colocación</w:t>
+            </w:r>
+          </w:p>
+        </w:tc>
+        <w:tc>
+          <w:tcPr>
+            <w:tcW w:w="0" w:type="auto"/>
+            <w:vAlign w:val="center"/>
+            <w:hideMark/>
+          </w:tcPr>
+          <w:p>
+            <w:pPr>
+              <w:rPr>
+                <w:b/>
+                <w:bCs/>
+              </w:rPr>
+            </w:pPr>
+            <w:r>
+              <w:rPr>
+                <w:b/>
+                <w:bCs/>
+              </w:rPr>
+              <w:t>Conexiones</w:t>
+            </w:r>
+          </w:p>
+        </w:tc>
+      </w:tr>
+      <w:tr>
+        <w:trPr>
+          <w:tblCellSpacing w:w="15" w:type="dxa"/>
+        </w:trPr>
+        <w:tc>
+          <w:tcPr>
+            <w:tcW w:w="0" w:type="auto"/>
+            <w:vAlign w:val="center"/>
+            <w:hideMark/>
+          </w:tcPr>
+          <w:p>
+            <w:r>
+              <w:rPr>
+                <w:b/>
+                <w:bCs/>
+              </w:rPr>
+              <w:t>Usuario / Cliente</w:t>
+            </w:r>
+          </w:p>
+        </w:tc>
+        <w:tc>
+          <w:tcPr>
+            <w:tcW w:w="0" w:type="auto"/>
+            <w:vAlign w:val="center"/>
+            <w:hideMark/>
+          </w:tcPr>
+          <w:p>
+            <w:r>
+              <w:t xml:space="preserve">General → </w:t>
+            </w:r>
+            <w:proofErr w:type="spellStart"/>
+            <w:r>
+              <w:t>User</w:t>
+            </w:r>
+            <w:proofErr w:type="spellEnd"/>
+          </w:p>
+        </w:tc>
+        <w:tc>
+          <w:tcPr>
+            <w:tcW w:w="0" w:type="auto"/>
+            <w:vAlign w:val="center"/>
+            <w:hideMark/>
+          </w:tcPr>
+          <w:p>
+            <w:r>
+              <w:t>Primer bloque derecha</w:t>
+            </w:r>
+          </w:p>
+        </w:tc>
+        <w:tc>
+          <w:tcPr>
+            <w:tcW w:w="0" w:type="auto"/>
+            <w:vAlign w:val="center"/>
+            <w:hideMark/>
+          </w:tcPr>
+          <w:p>
+            <w:r>
+              <w:t xml:space="preserve">Flecha </w:t>
+            </w:r>
+            <w:r>
+              <w:rPr>
+                <w:b/>
+                <w:bCs/>
+              </w:rPr>
+              <w:t>sólida</w:t>
+            </w:r>
+            <w:r>
+              <w:t xml:space="preserve"> → API Gateway</w:t>
+            </w:r>
+          </w:p>
+        </w:tc>
+      </w:tr>
+      <w:tr>
+        <w:trPr>
+          <w:tblCellSpacing w:w="15" w:type="dxa"/>
+        </w:trPr>
+        <w:tc>
+          <w:tcPr>
+            <w:tcW w:w="0" w:type="auto"/>
+            <w:vAlign w:val="center"/>
+            <w:hideMark/>
+          </w:tcPr>
+          <w:p>
+            <w:r>
+              <w:rPr>
+                <w:b/>
+                <w:bCs/>
+              </w:rPr>
+              <w:t>API Gateway</w:t>
+            </w:r>
+          </w:p>
+        </w:tc>
+        <w:tc>
+          <w:tcPr>
+            <w:tcW w:w="0" w:type="auto"/>
+            <w:vAlign w:val="center"/>
+            <w:hideMark/>
+          </w:tcPr>
+          <w:p>
+            <w:proofErr w:type="spellStart"/>
+            <w:r>
+              <w:t>Networking</w:t>
+            </w:r>
+            <w:proofErr w:type="spellEnd"/>
+            <w:r>
+              <w:t xml:space="preserve"> → API Gateway</w:t>
+            </w:r>
+          </w:p>
+        </w:tc>
+        <w:tc>
+          <w:tcPr>
+            <w:tcW w:w="0" w:type="auto"/>
+            <w:vAlign w:val="center"/>
+            <w:hideMark/>
+          </w:tcPr>
+          <w:p>
+            <w:r>
+              <w:t>Segunda fila derecha</w:t>
+            </w:r>
+          </w:p>
+        </w:tc>
+        <w:tc>
+          <w:tcPr>
+            <w:tcW w:w="0" w:type="auto"/>
+            <w:vAlign w:val="center"/>
+            <w:hideMark/>
+          </w:tcPr>
+          <w:p>
+            <w:r>
+              <w:t xml:space="preserve">Flecha </w:t>
+            </w:r>
+            <w:r>
+              <w:rPr>
+                <w:b/>
+                <w:bCs/>
+              </w:rPr>
+              <w:t>sólida</w:t>
+            </w:r>
+            <w:r>
+              <w:t xml:space="preserve"> → Lambda</w:t>
+            </w:r>
+          </w:p>
+        </w:tc>
+      </w:tr>
+      <w:tr>
+        <w:trPr>
+          <w:tblCellSpacing w:w="15" w:type="dxa"/>
+        </w:trPr>
+        <w:tc>
+          <w:tcPr>
+            <w:tcW w:w="0" w:type="auto"/>
+            <w:vAlign w:val="center"/>
+            <w:hideMark/>
+          </w:tcPr>
+          <w:p>
+            <w:r>
+              <w:rPr>
+                <w:b/>
+                <w:bCs/>
+              </w:rPr>
+              <w:t>Lambda (orquestación online)</w:t>
+            </w:r>
+          </w:p>
+        </w:tc>
+        <w:tc>
+          <w:tcPr>
+            <w:tcW w:w="0" w:type="auto"/>
+            <w:vAlign w:val="center"/>
+            <w:hideMark/>
+          </w:tcPr>
+          <w:p>
+            <w:r>
+              <w:t>Compute → Lambda</w:t>
+            </w:r>
+          </w:p>
+        </w:tc>
+        <w:tc>
+          <w:tcPr>
+            <w:tcW w:w="0" w:type="auto"/>
+            <w:vAlign w:val="center"/>
+            <w:hideMark/>
+          </w:tcPr>
+          <w:p>
+            <w:r>
+              <w:t>Tercera fila derecha</w:t>
+            </w:r>
+          </w:p>
+        </w:tc>
+        <w:tc>
+          <w:tcPr>
+            <w:tcW w:w="0" w:type="auto"/>
+            <w:vAlign w:val="center"/>
+            <w:hideMark/>
+          </w:tcPr>
+          <w:p>
+            <w:r>
+              <w:t xml:space="preserve">Flecha </w:t>
+            </w:r>
+            <w:r>
+              <w:rPr>
+                <w:b/>
+                <w:bCs/>
+              </w:rPr>
+              <w:t>sólida</w:t>
+            </w:r>
+            <w:r>
+              <w:t xml:space="preserve"> → </w:t>
+            </w:r>
+            <w:proofErr w:type="spellStart"/>
+            <w:r>
+              <w:t>SageMaker</w:t>
+            </w:r>
+            <w:proofErr w:type="spellEnd"/>
+            <w:r>
+              <w:t xml:space="preserve"> </w:t>
+            </w:r>
+            <w:proofErr w:type="spellStart"/>
+            <w:r>
+              <w:t>Endpoint</w:t>
+            </w:r>
+            <w:proofErr w:type="spellEnd"/>
+            <w:r>
+              <w:t xml:space="preserve">; flecha </w:t>
+            </w:r>
+            <w:r>
+              <w:rPr>
+                <w:b/>
+                <w:bCs/>
+              </w:rPr>
+              <w:t>punteada</w:t>
+            </w:r>
+            <w:r>
+              <w:t xml:space="preserve"> → S3 FEATURES; flecha </w:t>
+            </w:r>
+            <w:r>
+              <w:rPr>
+                <w:b/>
+                <w:bCs/>
+              </w:rPr>
+              <w:t>punteada</w:t>
+            </w:r>
+            <w:r>
+              <w:t xml:space="preserve"> → S3 MODELS / </w:t>
+            </w:r>
+            <w:proofErr w:type="spellStart"/>
+            <w:r>
+              <w:t>Model</w:t>
+            </w:r>
+            <w:proofErr w:type="spellEnd"/>
+            <w:r>
+              <w:t xml:space="preserve"> </w:t>
+            </w:r>
+            <w:proofErr w:type="spellStart"/>
+            <w:r>
+              <w:t>Registry</w:t>
+            </w:r>
+            <w:proofErr w:type="spellEnd"/>
+          </w:p>
+        </w:tc>
+      </w:tr>
+      <w:tr>
+        <w:trPr>
+          <w:tblCellSpacing w:w="15" w:type="dxa"/>
+        </w:trPr>
+        <w:tc>
+          <w:tcPr>
+            <w:tcW w:w="0" w:type="auto"/>
+            <w:vAlign w:val="center"/>
+            <w:hideMark/>
+          </w:tcPr>
+          <w:p>
+            <w:proofErr w:type="spellStart"/>
+            <w:r>
+              <w:rPr>
+                <w:b/>
+                <w:bCs/>
+              </w:rPr>
+              <w:t>SageMaker</w:t>
+            </w:r>
+            <w:proofErr w:type="spellEnd"/>
+            <w:r>
+              <w:rPr>
+                <w:b/>
+                <w:bCs/>
+              </w:rPr>
+              <w:t xml:space="preserve"> </w:t>
+            </w:r>
+            <w:proofErr w:type="spellStart"/>
+            <w:r>
+              <w:rPr>
+                <w:b/>
+                <w:bCs/>
+              </w:rPr>
+              <w:t>Endpoint</w:t>
+            </w:r>
+            <w:proofErr w:type="spellEnd"/>
+            <w:r>
+              <w:rPr>
+                <w:b/>
+                <w:bCs/>
+              </w:rPr>
+              <w:t xml:space="preserve"> (Predicción online)</w:t>
+            </w:r>
+          </w:p>
+        </w:tc>
+        <w:tc>
+          <w:tcPr>
+            <w:tcW w:w="0" w:type="auto"/>
+            <w:vAlign w:val="center"/>
+            <w:hideMark/>
+          </w:tcPr>
+          <w:p>
+            <w:r>
+              <w:t xml:space="preserve">Machine </w:t>
+            </w:r>
+            <w:proofErr w:type="spellStart"/>
+            <w:r>
+              <w:t>Learning</w:t>
+            </w:r>
+            <w:proofErr w:type="spellEnd"/>
+            <w:r>
+              <w:t xml:space="preserve"> → </w:t>
+            </w:r>
+            <w:proofErr w:type="spellStart"/>
+            <w:r>
+              <w:t>SageMaker</w:t>
+            </w:r>
+            <w:proofErr w:type="spellEnd"/>
+            <w:r>
+              <w:t xml:space="preserve"> </w:t>
+            </w:r>
+            <w:proofErr w:type="spellStart"/>
+            <w:r>
+              <w:t>Endpoint</w:t>
+            </w:r>
+            <w:proofErr w:type="spellEnd"/>
+          </w:p>
+        </w:tc>
+        <w:tc>
+          <w:tcPr>
+            <w:tcW w:w="0" w:type="auto"/>
+            <w:vAlign w:val="center"/>
+            <w:hideMark/>
+          </w:tcPr>
+          <w:p>
+            <w:r>
+              <w:t>Cuarta fila</w:t>
+            </w:r>
+          </w:p>
+        </w:tc>
+        <w:tc>
+          <w:tcPr>
+            <w:tcW w:w="0" w:type="auto"/>
+            <w:vAlign w:val="center"/>
+            <w:hideMark/>
+          </w:tcPr>
+          <w:p>
+            <w:r>
+              <w:t xml:space="preserve">Flecha </w:t>
+            </w:r>
+            <w:r>
+              <w:rPr>
+                <w:b/>
+                <w:bCs/>
+              </w:rPr>
+              <w:t>sólida</w:t>
+            </w:r>
+            <w:r>
+              <w:t xml:space="preserve"> → Resultado al usuario</w:t>
+            </w:r>
+          </w:p>
+        </w:tc>
+      </w:tr>
+      <w:tr>
+        <w:trPr>
+          <w:tblCellSpacing w:w="15" w:type="dxa"/>
+        </w:trPr>
+        <w:tc>
+          <w:tcPr>
+            <w:tcW w:w="0" w:type="auto"/>
+            <w:vAlign w:val="center"/>
+            <w:hideMark/>
+          </w:tcPr>
+          <w:p>
+            <w:r>
+              <w:rPr>
+                <w:b/>
+                <w:bCs/>
+              </w:rPr>
+              <w:t>Resultado al Usuario</w:t>
+            </w:r>
+          </w:p>
+        </w:tc>
+        <w:tc>
+          <w:tcPr>
+            <w:tcW w:w="0" w:type="auto"/>
+            <w:vAlign w:val="center"/>
+            <w:hideMark/>
+          </w:tcPr>
+          <w:p>
+            <w:r>
+              <w:t>Rectángulo genérico</w:t>
+            </w:r>
+          </w:p>
+        </w:tc>
+        <w:tc>
+          <w:tcPr>
+            <w:tcW w:w="0" w:type="auto"/>
+            <w:vAlign w:val="center"/>
+            <w:hideMark/>
+          </w:tcPr>
+          <w:p>
+            <w:r>
+              <w:t>Quinta fila</w:t>
+            </w:r>
+          </w:p>
+        </w:tc>
+        <w:tc>
+          <w:tcPr>
+            <w:tcW w:w="0" w:type="auto"/>
+            <w:vAlign w:val="center"/>
+            <w:hideMark/>
+          </w:tcPr>
+          <w:p>
+            <w:r>
+              <w:t xml:space="preserve">Flecha </w:t>
+            </w:r>
+            <w:r>
+              <w:rPr>
+                <w:b/>
+                <w:bCs/>
+              </w:rPr>
+              <w:t>sólida</w:t>
+            </w:r>
+            <w:r>
+              <w:t xml:space="preserve"> ← </w:t>
+            </w:r>
+            <w:proofErr w:type="spellStart"/>
+            <w:r>
+              <w:t>SageMaker</w:t>
+            </w:r>
+            <w:proofErr w:type="spellEnd"/>
+            <w:r>
+              <w:t xml:space="preserve"> </w:t>
+            </w:r>
+            <w:proofErr w:type="spellStart"/>
+            <w:r>
+              <w:t>Endpoint</w:t>
+            </w:r>
+            <w:proofErr w:type="spellEnd"/>
+          </w:p>
+        </w:tc>
+      </w:tr>
+    </w:tbl>
+    <w:p>
+      <w:pPr>
+        <w:rPr>
+          <w:lang w:val="en-GB"/>
+        </w:rPr>
+      </w:pPr>
+    </w:p>
+    <w:p>
+      <w:pPr>
+        <w:rPr>
+          <w:lang w:val="en-GB"/>
+        </w:rPr>
+      </w:pPr>
+    </w:p>
+    <w:p>
+      <w:pPr>
+        <w:rPr>
+          <w:lang w:val="en-GB"/>
+        </w:rPr>
+      </w:pPr>
+    </w:p>
+    <w:tbl>
+      <w:tblPr>
+        <w:tblW w:w="0" w:type="auto"/>
+        <w:tblCellSpacing w:w="15" w:type="dxa"/>
+        <w:tblCellMar>
+          <w:top w:w="15" w:type="dxa"/>
+          <w:left w:w="15" w:type="dxa"/>
+          <w:bottom w:w="15" w:type="dxa"/>
+          <w:right w:w="15" w:type="dxa"/>
+        </w:tblCellMar>
+        <w:tblLook w:val="04A0" w:firstRow="1" w:lastRow="0" w:firstColumn="1" w:lastColumn="0" w:noHBand="0" w:noVBand="1"/>
+      </w:tblPr>
+      <w:tblGrid>
+        <w:gridCol w:w="1689"/>
+        <w:gridCol w:w="1189"/>
+        <w:gridCol w:w="1177"/>
+        <w:gridCol w:w="4449"/>
+      </w:tblGrid>
+      <w:tr>
+        <w:trPr>
+          <w:tblHeader/>
+          <w:tblCellSpacing w:w="15" w:type="dxa"/>
+        </w:trPr>
+        <w:tc>
+          <w:tcPr>
+            <w:tcW w:w="0" w:type="auto"/>
+            <w:vAlign w:val="center"/>
+            <w:hideMark/>
+          </w:tcPr>
+          <w:p>
+            <w:pPr>
+              <w:rPr>
+                <w:b/>
+                <w:bCs/>
+              </w:rPr>
+            </w:pPr>
+            <w:r>
+              <w:rPr>
+                <w:b/>
+                <w:bCs/>
+              </w:rPr>
+              <w:lastRenderedPageBreak/>
+              <w:t>Elemento</w:t>
+            </w:r>
+          </w:p>
+        </w:tc>
+        <w:tc>
+          <w:tcPr>
+            <w:tcW w:w="0" w:type="auto"/>
+            <w:vAlign w:val="center"/>
+            <w:hideMark/>
+          </w:tcPr>
+          <w:p>
+            <w:pPr>
+              <w:rPr>
+                <w:b/>
+                <w:bCs/>
+              </w:rPr>
+            </w:pPr>
+            <w:r>
+              <w:rPr>
+                <w:b/>
+                <w:bCs/>
+              </w:rPr>
+              <w:t>Icono draw.io</w:t>
+            </w:r>
+          </w:p>
+        </w:tc>
+        <w:tc>
+          <w:tcPr>
+            <w:tcW w:w="0" w:type="auto"/>
+            <w:vAlign w:val="center"/>
+            <w:hideMark/>
+          </w:tcPr>
+          <w:p>
+            <w:pPr>
+              <w:rPr>
+                <w:b/>
+                <w:bCs/>
+              </w:rPr>
+            </w:pPr>
+            <w:r>
+              <w:rPr>
+                <w:b/>
+                <w:bCs/>
+              </w:rPr>
+              <w:t>Colocación</w:t>
+            </w:r>
+          </w:p>
+        </w:tc>
+        <w:tc>
+          <w:tcPr>
+            <w:tcW w:w="0" w:type="auto"/>
+            <w:vAlign w:val="center"/>
+            <w:hideMark/>
+          </w:tcPr>
+          <w:p>
+            <w:pPr>
+              <w:rPr>
+                <w:b/>
+                <w:bCs/>
+              </w:rPr>
+            </w:pPr>
+            <w:r>
+              <w:rPr>
+                <w:b/>
+                <w:bCs/>
+              </w:rPr>
+              <w:t>Conexiones</w:t>
+            </w:r>
+          </w:p>
+        </w:tc>
+      </w:tr>
+      <w:tr>
+        <w:trPr>
+          <w:tblCellSpacing w:w="15" w:type="dxa"/>
+        </w:trPr>
+        <w:tc>
+          <w:tcPr>
+            <w:tcW w:w="0" w:type="auto"/>
+            <w:vAlign w:val="center"/>
+            <w:hideMark/>
+          </w:tcPr>
+          <w:p>
+            <w:proofErr w:type="spellStart"/>
+            <w:r>
+              <w:rPr>
+                <w:b/>
+                <w:bCs/>
+              </w:rPr>
+              <w:t>CodeCommit</w:t>
+            </w:r>
+            <w:proofErr w:type="spellEnd"/>
+            <w:r>
+              <w:rPr>
+                <w:b/>
+                <w:bCs/>
+              </w:rPr>
+              <w:t xml:space="preserve"> / Repo Git</w:t>
+            </w:r>
+          </w:p>
+        </w:tc>
+        <w:tc>
+          <w:tcPr>
+            <w:tcW w:w="0" w:type="auto"/>
+            <w:vAlign w:val="center"/>
+            <w:hideMark/>
+          </w:tcPr>
+          <w:p>
+            <w:proofErr w:type="spellStart"/>
+            <w:r>
+              <w:t>Repository</w:t>
+            </w:r>
+            <w:proofErr w:type="spellEnd"/>
+            <w:r>
+              <w:t xml:space="preserve"> </w:t>
+            </w:r>
+            <w:proofErr w:type="spellStart"/>
+            <w:r>
+              <w:t>Icon</w:t>
+            </w:r>
+            <w:proofErr w:type="spellEnd"/>
+          </w:p>
+        </w:tc>
+        <w:tc>
+          <w:tcPr>
+            <w:tcW w:w="0" w:type="auto"/>
+            <w:vAlign w:val="center"/>
+            <w:hideMark/>
+          </w:tcPr>
+          <w:p>
+            <w:r>
+              <w:t>Abajo del todo</w:t>
+            </w:r>
+          </w:p>
+        </w:tc>
+        <w:tc>
+          <w:tcPr>
+            <w:tcW w:w="0" w:type="auto"/>
+            <w:vAlign w:val="center"/>
+            <w:hideMark/>
+          </w:tcPr>
+          <w:p>
+            <w:r>
+              <w:t xml:space="preserve">Flecha </w:t>
+            </w:r>
+            <w:r>
+              <w:rPr>
+                <w:b/>
+                <w:bCs/>
+              </w:rPr>
+              <w:t>punteada</w:t>
+            </w:r>
+            <w:r>
+              <w:t xml:space="preserve"> → </w:t>
+            </w:r>
+            <w:proofErr w:type="spellStart"/>
+            <w:r>
+              <w:t>CodeBuild</w:t>
+            </w:r>
+            <w:proofErr w:type="spellEnd"/>
+          </w:p>
+        </w:tc>
+      </w:tr>
+      <w:tr>
+        <w:trPr>
+          <w:tblCellSpacing w:w="15" w:type="dxa"/>
+        </w:trPr>
+        <w:tc>
+          <w:tcPr>
+            <w:tcW w:w="0" w:type="auto"/>
+            <w:vAlign w:val="center"/>
+            <w:hideMark/>
+          </w:tcPr>
+          <w:p>
+            <w:proofErr w:type="spellStart"/>
+            <w:r>
+              <w:rPr>
+                <w:b/>
+                <w:bCs/>
+              </w:rPr>
+              <w:t>CodeBuild</w:t>
+            </w:r>
+            <w:proofErr w:type="spellEnd"/>
+          </w:p>
+        </w:tc>
+        <w:tc>
+          <w:tcPr>
+            <w:tcW w:w="0" w:type="auto"/>
+            <w:vAlign w:val="center"/>
+            <w:hideMark/>
+          </w:tcPr>
+          <w:p>
+            <w:proofErr w:type="spellStart"/>
+            <w:r>
+              <w:t>Build</w:t>
+            </w:r>
+            <w:proofErr w:type="spellEnd"/>
+            <w:r>
+              <w:t xml:space="preserve"> </w:t>
+            </w:r>
+            <w:proofErr w:type="spellStart"/>
+            <w:r>
+              <w:t>icon</w:t>
+            </w:r>
+            <w:proofErr w:type="spellEnd"/>
+          </w:p>
+        </w:tc>
+        <w:tc>
+          <w:tcPr>
+            <w:tcW w:w="0" w:type="auto"/>
+            <w:vAlign w:val="center"/>
+            <w:hideMark/>
+          </w:tcPr>
+          <w:p>
+            <w:r>
+              <w:t>Parte inferior</w:t>
+            </w:r>
+          </w:p>
+        </w:tc>
+        <w:tc>
+          <w:tcPr>
+            <w:tcW w:w="0" w:type="auto"/>
+            <w:vAlign w:val="center"/>
+            <w:hideMark/>
+          </w:tcPr>
+          <w:p>
+            <w:r>
+              <w:t xml:space="preserve">Flecha </w:t>
+            </w:r>
+            <w:r>
+              <w:rPr>
+                <w:b/>
+                <w:bCs/>
+              </w:rPr>
+              <w:t>punteada</w:t>
+            </w:r>
+            <w:r>
+              <w:t xml:space="preserve"> → </w:t>
+            </w:r>
+            <w:proofErr w:type="spellStart"/>
+            <w:r>
+              <w:t>CodePipeline</w:t>
+            </w:r>
+            <w:proofErr w:type="spellEnd"/>
+          </w:p>
+        </w:tc>
+      </w:tr>
+      <w:tr>
+        <w:trPr>
+          <w:tblCellSpacing w:w="15" w:type="dxa"/>
+        </w:trPr>
+        <w:tc>
+          <w:tcPr>
+            <w:tcW w:w="0" w:type="auto"/>
+            <w:vAlign w:val="center"/>
+            <w:hideMark/>
+          </w:tcPr>
+          <w:p>
+            <w:proofErr w:type="spellStart"/>
+            <w:r>
+              <w:rPr>
+                <w:b/>
+                <w:bCs/>
+              </w:rPr>
+              <w:t>CodePipeline</w:t>
+            </w:r>
+            <w:proofErr w:type="spellEnd"/>
+          </w:p>
+        </w:tc>
+        <w:tc>
+          <w:tcPr>
+            <w:tcW w:w="0" w:type="auto"/>
+            <w:vAlign w:val="center"/>
+            <w:hideMark/>
+          </w:tcPr>
+          <w:p>
+            <w:r>
+              <w:t>CI/CD Pipeline</w:t>
+            </w:r>
+          </w:p>
+        </w:tc>
+        <w:tc>
+          <w:tcPr>
+            <w:tcW w:w="0" w:type="auto"/>
+            <w:vAlign w:val="center"/>
+            <w:hideMark/>
+          </w:tcPr>
+          <w:p>
+            <w:r>
+              <w:t>Parte inferior</w:t>
+            </w:r>
+          </w:p>
+        </w:tc>
+        <w:tc>
+          <w:tcPr>
+            <w:tcW w:w="0" w:type="auto"/>
+            <w:vAlign w:val="center"/>
+            <w:hideMark/>
+          </w:tcPr>
+          <w:p>
+            <w:pPr>
+              <w:rPr>
+                <w:lang w:val="en-GB"/>
+              </w:rPr>
+            </w:pPr>
+            <w:r>
+              <w:rPr>
+                <w:lang w:val="en-GB"/>
+              </w:rPr>
+              <w:t xml:space="preserve">Flechas </w:t>
+            </w:r>
+            <w:r>
+              <w:rPr>
+                <w:b/>
+                <w:bCs/>
+                <w:lang w:val="en-GB"/>
+              </w:rPr>
+              <w:t>punteadas</w:t>
+            </w:r>
+            <w:r>
+              <w:rPr>
+                <w:lang w:val="en-GB"/>
+              </w:rPr>
+              <w:t xml:space="preserve"> → Step Functions, Lambda, SageMaker Training, SageMaker Endpoint (deployment)</w:t>
+            </w:r>
+          </w:p>
+        </w:tc>
+      </w:tr>
+      <w:tr>
+        <w:trPr>
+          <w:tblCellSpacing w:w="15" w:type="dxa"/>
+        </w:trPr>
+        <w:tc>
+          <w:tcPr>
+            <w:tcW w:w="0" w:type="auto"/>
+            <w:vAlign w:val="center"/>
+            <w:hideMark/>
+          </w:tcPr>
+          <w:p>
+            <w:proofErr w:type="spellStart"/>
+            <w:r>
+              <w:rPr>
+                <w:b/>
+                <w:bCs/>
+              </w:rPr>
+              <w:t>Tests</w:t>
+            </w:r>
+            <w:proofErr w:type="spellEnd"/>
+            <w:r>
+              <w:rPr>
+                <w:b/>
+                <w:bCs/>
+              </w:rPr>
+              <w:t xml:space="preserve"> / </w:t>
+            </w:r>
+            <w:proofErr w:type="spellStart"/>
+            <w:r>
+              <w:rPr>
+                <w:b/>
+                <w:bCs/>
+              </w:rPr>
+              <w:t>Unit</w:t>
+            </w:r>
+            <w:proofErr w:type="spellEnd"/>
+            <w:r>
+              <w:rPr>
+                <w:b/>
+                <w:bCs/>
+              </w:rPr>
+              <w:t xml:space="preserve"> / </w:t>
+            </w:r>
+            <w:proofErr w:type="spellStart"/>
+            <w:r>
+              <w:rPr>
+                <w:b/>
+                <w:bCs/>
+              </w:rPr>
+              <w:t>Integration</w:t>
+            </w:r>
+            <w:proofErr w:type="spellEnd"/>
+          </w:p>
+        </w:tc>
+        <w:tc>
+          <w:tcPr>
+            <w:tcW w:w="0" w:type="auto"/>
+            <w:vAlign w:val="center"/>
+            <w:hideMark/>
+          </w:tcPr>
+          <w:p>
+            <w:proofErr w:type="spellStart"/>
+            <w:r>
+              <w:t>Checklist</w:t>
+            </w:r>
+            <w:proofErr w:type="spellEnd"/>
+          </w:p>
+        </w:tc>
+        <w:tc>
+          <w:tcPr>
+            <w:tcW w:w="0" w:type="auto"/>
+            <w:vAlign w:val="center"/>
+            <w:hideMark/>
+          </w:tcPr>
+          <w:p>
+            <w:r>
+              <w:t>Abajo</w:t>
+            </w:r>
+          </w:p>
+        </w:tc>
+        <w:tc>
+          <w:tcPr>
+            <w:tcW w:w="0" w:type="auto"/>
+            <w:vAlign w:val="center"/>
+            <w:hideMark/>
+          </w:tcPr>
+          <w:p>
+            <w:r>
+              <w:t xml:space="preserve">Flecha </w:t>
+            </w:r>
+            <w:r>
+              <w:rPr>
+                <w:b/>
+                <w:bCs/>
+              </w:rPr>
+              <w:t>punteada</w:t>
+            </w:r>
+            <w:r>
+              <w:t xml:space="preserve"> → </w:t>
+            </w:r>
+            <w:proofErr w:type="spellStart"/>
+            <w:r>
+              <w:t>CodeBuild</w:t>
+            </w:r>
+            <w:proofErr w:type="spellEnd"/>
+            <w:r>
+              <w:t xml:space="preserve"> / </w:t>
+            </w:r>
+            <w:proofErr w:type="spellStart"/>
+            <w:r>
+              <w:t>CodePipeline</w:t>
+            </w:r>
+            <w:proofErr w:type="spellEnd"/>
+          </w:p>
+        </w:tc>
+      </w:tr>
+    </w:tbl>
+    <w:p>
+      <w:pPr>
+        <w:rPr>
+          <w:lang w:val="en-GB"/>
+        </w:rPr>
+      </w:pPr>
+    </w:p>
     <w:sectPr>
       <w:pgSz w:w="11906" w:h="16838"/>
       <w:pgMar w:top="1417" w:right="1701" w:bottom="1417" w:left="1701" w:header="708" w:footer="708" w:gutter="0"/>

</xml_diff>